<commit_message>
Add section on GitHub CLI tool
</commit_message>
<xml_diff>
--- a/files/mine-the-backlog/mine-the-backlog.docx
+++ b/files/mine-the-backlog/mine-the-backlog.docx
@@ -113,7 +113,15 @@
         <w:pStyle w:val="ListNumber"/>
       </w:pPr>
       <w:r>
-        <w:t>What form you want the answer in (a short written summary vs. a table vs. counts per category) so Claude doesn't just dump raw data back at you.</w:t>
+        <w:t xml:space="preserve">What form you want the answer in (a </w:t>
+      </w:r>
+      <w:proofErr w:type="gramStart"/>
+      <w:r>
+        <w:t>short written</w:t>
+      </w:r>
+      <w:proofErr w:type="gramEnd"/>
+      <w:r>
+        <w:t xml:space="preserve"> summary vs. a table vs. counts per category) so Claude doesn't just dump raw data back at you.</w:t>
       </w:r>
     </w:p>
     <w:p>
@@ -148,6 +156,7 @@
       <w:r>
         <w:t xml:space="preserve">, one </w:t>
       </w:r>
+      <w:proofErr w:type="gramStart"/>
       <w:r>
         <w:rPr>
           <w:rFonts w:ascii="Consolas" w:hAnsi="Consolas"/>
@@ -156,7 +165,11 @@
         <w:t>status</w:t>
       </w:r>
       <w:r>
-        <w:t xml:space="preserve">) — there's no history of past statuses or iteration changes in that output, and no </w:t>
+        <w:t>) —</w:t>
+      </w:r>
+      <w:proofErr w:type="gramEnd"/>
+      <w:r>
+        <w:t xml:space="preserve"> there's no history of past statuses or iteration changes in that output, and no </w:t>
       </w:r>
       <w:r>
         <w:rPr>
@@ -307,7 +320,11 @@
         <w:t>gh project item-list</w:t>
       </w:r>
       <w:r>
-        <w:t xml:space="preserve"> is the right tool, but it paginates and defaults to a small page size — you need to know to raise </w:t>
+        <w:t xml:space="preserve"> is the right tool, but it paginates and defaults to a small page size — you need to know to </w:t>
+      </w:r>
+      <w:proofErr w:type="gramStart"/>
+      <w:r>
+        <w:t xml:space="preserve">raise </w:t>
       </w:r>
       <w:r>
         <w:rPr>
@@ -316,6 +333,7 @@
         </w:rPr>
         <w:t>--limit</w:t>
       </w:r>
+      <w:proofErr w:type="gramEnd"/>
       <w:r>
         <w:t>, and that the output is one flat JSON blob you'll want to pipe somewhere or have Claude process programmatically rather than read inline.</w:t>
       </w:r>
@@ -325,7 +343,15 @@
         <w:pStyle w:val="ListBullet"/>
       </w:pPr>
       <w:r>
-        <w:t>"Patterns" is vague on purpose. Recurring bug categories? A repo that dominates the list? Tickets that sat open for a long time before being picked up? A stream that never seems to get "Completed"? Claude can only find what you ask it to look for — an open-ended prompt will get you an open-ended (i.e. shallow) answer.</w:t>
+        <w:t xml:space="preserve">"Patterns" </w:t>
+      </w:r>
+      <w:proofErr w:type="gramStart"/>
+      <w:r>
+        <w:t>is</w:t>
+      </w:r>
+      <w:proofErr w:type="gramEnd"/>
+      <w:r>
+        <w:t xml:space="preserve"> vague on purpose. Recurring bug categories? A repo that dominates the list? Tickets that sat open for a long time before being picked up? A stream that never seems to get "Completed"? Claude can only find what you ask it to look for — an open-ended prompt will get you an open-ended (i.e. shallow) answer.</w:t>
       </w:r>
     </w:p>
     <w:p>
@@ -335,15 +361,32 @@
       <w:r>
         <w:t xml:space="preserve">Expect the data to be noisy in a specific, boring way: a large chunk of the items (roughly 40%+) are likely to be </w:t>
       </w:r>
+      <w:proofErr w:type="gramStart"/>
       <w:r>
         <w:rPr>
           <w:rFonts w:ascii="Consolas" w:hAnsi="Consolas"/>
           <w:sz w:val="20"/>
         </w:rPr>
-        <w:t>renovate-bot</w:t>
-      </w:r>
-      <w:r>
-        <w:t xml:space="preserve"> dependency-bump PRs, not human-authored work. If you don't tell Claude to separate or filter that out, "busiest repo" and "most common label" answers will just describe the bot's activity, not your team's. Similarly, expect label names to be inconsistent (e.g. several different spellings/emoji variants of "blocked") — that's real backlog hygiene debt, not a query bug.</w:t>
+        <w:t>renovate</w:t>
+      </w:r>
+      <w:proofErr w:type="gramEnd"/>
+      <w:r>
+        <w:rPr>
+          <w:rFonts w:ascii="Consolas" w:hAnsi="Consolas"/>
+          <w:sz w:val="20"/>
+        </w:rPr>
+        <w:t>-bot</w:t>
+      </w:r>
+      <w:r>
+        <w:t xml:space="preserve"> dependency-bump PRs, not human-authored work. If you don't tell Claude to separate or filter that out, "busiest repo" and "most common label" answers will just describe the bot's activity, not your team's. Similarly, expect label names to be inconsistent (e.g. several different spellings/emoji variants of "blocked</w:t>
+      </w:r>
+      <w:proofErr w:type="gramStart"/>
+      <w:r>
+        <w:t>") —</w:t>
+      </w:r>
+      <w:proofErr w:type="gramEnd"/>
+      <w:r>
+        <w:t xml:space="preserve"> that's real backlog hygiene debt, not a query bug.</w:t>
       </w:r>
     </w:p>
     <w:p>
@@ -352,6 +395,378 @@
       </w:pPr>
       <w:r>
         <w:t>The org data is real and shared — this is read-only exploration, so it's safe, but it's still someone else's team's backlog. Don't have Claude post comments, change fields, or otherwise write back to the board.</w:t>
+      </w:r>
+    </w:p>
+    <w:p>
+      <w:pPr>
+        <w:pStyle w:val="Heading2"/>
+      </w:pPr>
+      <w:r>
+        <w:t>Setting up GitHub CLI so Claude can read the data</w:t>
+      </w:r>
+    </w:p>
+    <w:p>
+      <w:pPr>
+        <w:pStyle w:val="ListBullet"/>
+        <w:numPr>
+          <w:ilvl w:val="0"/>
+          <w:numId w:val="0"/>
+        </w:numPr>
+      </w:pPr>
+    </w:p>
+    <w:p>
+      <w:pPr>
+        <w:pStyle w:val="ListBullet"/>
+        <w:numPr>
+          <w:ilvl w:val="0"/>
+          <w:numId w:val="0"/>
+        </w:numPr>
+      </w:pPr>
+      <w:r>
+        <w:t xml:space="preserve">This task pulls its data from a GitHub Projects board via the </w:t>
+      </w:r>
+      <w:proofErr w:type="spellStart"/>
+      <w:r>
+        <w:rPr>
+          <w:rFonts w:ascii="Courier New" w:hAnsi="Courier New" w:cs="Courier New"/>
+        </w:rPr>
+        <w:t>gh</w:t>
+      </w:r>
+      <w:proofErr w:type="spellEnd"/>
+      <w:r>
+        <w:t xml:space="preserve"> command line tool, using </w:t>
+      </w:r>
+      <w:proofErr w:type="spellStart"/>
+      <w:r>
+        <w:rPr>
+          <w:rFonts w:ascii="Courier New" w:hAnsi="Courier New" w:cs="Courier New"/>
+        </w:rPr>
+        <w:t>gh</w:t>
+      </w:r>
+      <w:proofErr w:type="spellEnd"/>
+      <w:r>
+        <w:rPr>
+          <w:rFonts w:ascii="Courier New" w:hAnsi="Courier New" w:cs="Courier New"/>
+        </w:rPr>
+        <w:t xml:space="preserve"> </w:t>
+      </w:r>
+      <w:proofErr w:type="spellStart"/>
+      <w:r>
+        <w:rPr>
+          <w:rFonts w:ascii="Courier New" w:hAnsi="Courier New" w:cs="Courier New"/>
+        </w:rPr>
+        <w:t>api</w:t>
+      </w:r>
+      <w:proofErr w:type="spellEnd"/>
+      <w:r>
+        <w:rPr>
+          <w:rFonts w:ascii="Courier New" w:hAnsi="Courier New" w:cs="Courier New"/>
+        </w:rPr>
+        <w:t xml:space="preserve"> </w:t>
+      </w:r>
+      <w:proofErr w:type="spellStart"/>
+      <w:r>
+        <w:rPr>
+          <w:rFonts w:ascii="Courier New" w:hAnsi="Courier New" w:cs="Courier New"/>
+        </w:rPr>
+        <w:t>graphql</w:t>
+      </w:r>
+      <w:proofErr w:type="spellEnd"/>
+      <w:r>
+        <w:t xml:space="preserve"> to query</w:t>
+      </w:r>
+      <w:r>
+        <w:t xml:space="preserve"> </w:t>
+      </w:r>
+      <w:r>
+        <w:t xml:space="preserve">the project directly. Claude Code doesn't have its own separate connection to GitHub — it runs </w:t>
+      </w:r>
+      <w:proofErr w:type="spellStart"/>
+      <w:r>
+        <w:rPr>
+          <w:rFonts w:ascii="Courier New" w:hAnsi="Courier New" w:cs="Courier New"/>
+        </w:rPr>
+        <w:t>gh</w:t>
+      </w:r>
+      <w:proofErr w:type="spellEnd"/>
+      <w:r>
+        <w:t xml:space="preserve"> commands in your</w:t>
+      </w:r>
+      <w:r>
+        <w:t xml:space="preserve"> </w:t>
+      </w:r>
+      <w:r>
+        <w:t xml:space="preserve">terminal using your own GitHub identity and permissions, so </w:t>
+      </w:r>
+      <w:proofErr w:type="spellStart"/>
+      <w:r>
+        <w:rPr>
+          <w:rFonts w:ascii="Courier New" w:hAnsi="Courier New" w:cs="Courier New"/>
+        </w:rPr>
+        <w:t>gh</w:t>
+      </w:r>
+      <w:proofErr w:type="spellEnd"/>
+      <w:r>
+        <w:t xml:space="preserve"> needs to be installed and signed in before Claude</w:t>
+      </w:r>
+      <w:r>
+        <w:t xml:space="preserve"> </w:t>
+      </w:r>
+      <w:r>
+        <w:t>can read anything from the board.</w:t>
+      </w:r>
+    </w:p>
+    <w:p>
+      <w:pPr>
+        <w:pStyle w:val="ListBullet"/>
+        <w:numPr>
+          <w:ilvl w:val="0"/>
+          <w:numId w:val="0"/>
+        </w:numPr>
+      </w:pPr>
+    </w:p>
+    <w:p>
+      <w:pPr>
+        <w:pStyle w:val="ListBullet"/>
+        <w:numPr>
+          <w:ilvl w:val="0"/>
+          <w:numId w:val="0"/>
+        </w:numPr>
+      </w:pPr>
+      <w:r>
+        <w:t>To install:</w:t>
+      </w:r>
+    </w:p>
+    <w:p>
+      <w:pPr>
+        <w:pStyle w:val="ListBullet"/>
+        <w:numPr>
+          <w:ilvl w:val="0"/>
+          <w:numId w:val="13"/>
+        </w:numPr>
+      </w:pPr>
+      <w:r>
+        <w:t xml:space="preserve">Windows: </w:t>
+      </w:r>
+      <w:proofErr w:type="spellStart"/>
+      <w:r>
+        <w:rPr>
+          <w:rFonts w:ascii="Courier New" w:hAnsi="Courier New" w:cs="Courier New"/>
+        </w:rPr>
+        <w:t>winget</w:t>
+      </w:r>
+      <w:proofErr w:type="spellEnd"/>
+      <w:r>
+        <w:rPr>
+          <w:rFonts w:ascii="Courier New" w:hAnsi="Courier New" w:cs="Courier New"/>
+        </w:rPr>
+        <w:t xml:space="preserve"> install --id </w:t>
+      </w:r>
+      <w:proofErr w:type="spellStart"/>
+      <w:r>
+        <w:rPr>
+          <w:rFonts w:ascii="Courier New" w:hAnsi="Courier New" w:cs="Courier New"/>
+        </w:rPr>
+        <w:t>GitHub.cli</w:t>
+      </w:r>
+      <w:proofErr w:type="spellEnd"/>
+    </w:p>
+    <w:p>
+      <w:pPr>
+        <w:pStyle w:val="ListBullet"/>
+        <w:numPr>
+          <w:ilvl w:val="0"/>
+          <w:numId w:val="13"/>
+        </w:numPr>
+      </w:pPr>
+      <w:r>
+        <w:lastRenderedPageBreak/>
+        <w:t xml:space="preserve">Mac: </w:t>
+      </w:r>
+      <w:r>
+        <w:rPr>
+          <w:rFonts w:ascii="Courier New" w:hAnsi="Courier New" w:cs="Courier New"/>
+        </w:rPr>
+        <w:t xml:space="preserve">brew install </w:t>
+      </w:r>
+      <w:proofErr w:type="spellStart"/>
+      <w:r>
+        <w:rPr>
+          <w:rFonts w:ascii="Courier New" w:hAnsi="Courier New" w:cs="Courier New"/>
+        </w:rPr>
+        <w:t>gh</w:t>
+      </w:r>
+      <w:proofErr w:type="spellEnd"/>
+    </w:p>
+    <w:p>
+      <w:pPr>
+        <w:pStyle w:val="ListBullet"/>
+        <w:numPr>
+          <w:ilvl w:val="0"/>
+          <w:numId w:val="13"/>
+        </w:numPr>
+      </w:pPr>
+      <w:r>
+        <w:t>Linux: see github.com/cli/</w:t>
+      </w:r>
+      <w:proofErr w:type="spellStart"/>
+      <w:r>
+        <w:t>cli#installation</w:t>
+      </w:r>
+      <w:proofErr w:type="spellEnd"/>
+      <w:r>
+        <w:t xml:space="preserve"> for your distro's package manager</w:t>
+      </w:r>
+    </w:p>
+    <w:p>
+      <w:pPr>
+        <w:pStyle w:val="ListBullet"/>
+        <w:numPr>
+          <w:ilvl w:val="0"/>
+          <w:numId w:val="0"/>
+        </w:numPr>
+      </w:pPr>
+    </w:p>
+    <w:p>
+      <w:pPr>
+        <w:pStyle w:val="ListBullet"/>
+        <w:numPr>
+          <w:ilvl w:val="0"/>
+          <w:numId w:val="0"/>
+        </w:numPr>
+      </w:pPr>
+      <w:r>
+        <w:t xml:space="preserve">To </w:t>
+      </w:r>
+      <w:proofErr w:type="spellStart"/>
+      <w:r>
+        <w:t>authorise</w:t>
+      </w:r>
+      <w:proofErr w:type="spellEnd"/>
+      <w:r>
+        <w:t>:</w:t>
+      </w:r>
+    </w:p>
+    <w:p>
+      <w:pPr>
+        <w:pStyle w:val="ListBullet"/>
+        <w:numPr>
+          <w:ilvl w:val="0"/>
+          <w:numId w:val="0"/>
+        </w:numPr>
+      </w:pPr>
+      <w:r>
+        <w:t xml:space="preserve">Run </w:t>
+      </w:r>
+      <w:proofErr w:type="spellStart"/>
+      <w:r>
+        <w:rPr>
+          <w:rFonts w:ascii="Courier New" w:hAnsi="Courier New" w:cs="Courier New"/>
+        </w:rPr>
+        <w:t>gh</w:t>
+      </w:r>
+      <w:proofErr w:type="spellEnd"/>
+      <w:r>
+        <w:rPr>
+          <w:rFonts w:ascii="Courier New" w:hAnsi="Courier New" w:cs="Courier New"/>
+        </w:rPr>
+        <w:t xml:space="preserve"> auth login</w:t>
+      </w:r>
+      <w:r>
+        <w:t xml:space="preserve"> in a terminal and follow the prompts (choose GitHub.com, HTTPS, and log in via browser is</w:t>
+      </w:r>
+      <w:r>
+        <w:t xml:space="preserve"> </w:t>
+      </w:r>
+      <w:r>
+        <w:t xml:space="preserve">easiest). You'll need access to the red-gate GitHub </w:t>
+      </w:r>
+      <w:proofErr w:type="spellStart"/>
+      <w:r>
+        <w:t>organisation</w:t>
+      </w:r>
+      <w:proofErr w:type="spellEnd"/>
+      <w:r>
+        <w:t xml:space="preserve"> with your usual account. Once done, check it</w:t>
+      </w:r>
+      <w:r>
+        <w:t xml:space="preserve"> </w:t>
+      </w:r>
+      <w:r>
+        <w:t xml:space="preserve">worked with </w:t>
+      </w:r>
+      <w:proofErr w:type="spellStart"/>
+      <w:r>
+        <w:rPr>
+          <w:rFonts w:ascii="Courier New" w:hAnsi="Courier New" w:cs="Courier New"/>
+        </w:rPr>
+        <w:t>gh</w:t>
+      </w:r>
+      <w:proofErr w:type="spellEnd"/>
+      <w:r>
+        <w:rPr>
+          <w:rFonts w:ascii="Courier New" w:hAnsi="Courier New" w:cs="Courier New"/>
+        </w:rPr>
+        <w:t xml:space="preserve"> auth status</w:t>
+      </w:r>
+      <w:r>
+        <w:t xml:space="preserve"> — it should show you're logged in with the project and repo scopes, which are needed to</w:t>
+      </w:r>
+      <w:r>
+        <w:t xml:space="preserve"> </w:t>
+      </w:r>
+      <w:r>
+        <w:t>read Projects board data.</w:t>
+      </w:r>
+    </w:p>
+    <w:p>
+      <w:pPr>
+        <w:pStyle w:val="ListBullet"/>
+        <w:numPr>
+          <w:ilvl w:val="0"/>
+          <w:numId w:val="0"/>
+        </w:numPr>
+      </w:pPr>
+    </w:p>
+    <w:p>
+      <w:pPr>
+        <w:pStyle w:val="ListBullet"/>
+        <w:numPr>
+          <w:ilvl w:val="0"/>
+          <w:numId w:val="0"/>
+        </w:numPr>
+      </w:pPr>
+      <w:r>
+        <w:t xml:space="preserve">Hint: </w:t>
+      </w:r>
+      <w:r>
+        <w:t xml:space="preserve">Avoid using the GitHub MCP server: </w:t>
+      </w:r>
+      <w:r>
+        <w:t>you can’t use it without asking TechOps to make a f</w:t>
+      </w:r>
+      <w:r>
+        <w:t>ine</w:t>
+      </w:r>
+      <w:r>
+        <w:t>-</w:t>
+      </w:r>
+      <w:r>
+        <w:t>grained PAT</w:t>
+      </w:r>
+      <w:r>
+        <w:t xml:space="preserve">, and the </w:t>
+      </w:r>
+      <w:proofErr w:type="spellStart"/>
+      <w:r>
+        <w:rPr>
+          <w:rFonts w:ascii="Courier New" w:hAnsi="Courier New" w:cs="Courier New"/>
+        </w:rPr>
+        <w:t>gh</w:t>
+      </w:r>
+      <w:proofErr w:type="spellEnd"/>
+      <w:r>
+        <w:t xml:space="preserve"> CLI works perfectly well.</w:t>
       </w:r>
     </w:p>
     <w:p>
@@ -397,11 +812,15 @@
         <w:t>--limit</w:t>
       </w:r>
       <w:r>
-        <w:t xml:space="preserve"> so you get everything rather than the default page. This is read-only research: don't comment on, edit, or close anything on the board. Once you have the data, find patterns across three angles: (1) which repositories have the most items, (2) which labels or "Stream" values show up most often, and (3) any recurring themes in the issue titles or bodies (e.g. a type of bug or a kind of request that keeps showing up </w:t>
-      </w:r>
-      <w:r>
-        <w:lastRenderedPageBreak/>
-        <w:t>under different tickets). Summarize what you find in a short written report with a few bullet points per angle — not a raw data dump. Call out anything surprising, like a single repo or issue type that dominates the board.</w:t>
+        <w:t xml:space="preserve"> so you get everything rather than the default page. This is read-only research: don't comment on, edit, or close anything on the board. Once you have the data, find patterns across three angles: (1) which repositories have the most items, (2) which labels or "Stream" values show up most often, and (3) any recurring themes in the issue titles or bodies (e.g. a type of bug or a kind of request that keeps showing up under different tickets). Summarize what you find in a </w:t>
+      </w:r>
+      <w:proofErr w:type="gramStart"/>
+      <w:r>
+        <w:t>short written</w:t>
+      </w:r>
+      <w:proofErr w:type="gramEnd"/>
+      <w:r>
+        <w:t xml:space="preserve"> report with a few bullet points per angle — not a raw data dump. Call out anything surprising, like a single repo or issue type that dominates the board.</w:t>
       </w:r>
     </w:p>
     <w:sectPr>
@@ -584,6 +1003,457 @@
       </w:pPr>
       <w:rPr>
         <w:rFonts w:ascii="Symbol" w:hAnsi="Symbol" w:hint="default"/>
+      </w:rPr>
+    </w:lvl>
+  </w:abstractNum>
+  <w:abstractNum w:abstractNumId="9" w15:restartNumberingAfterBreak="0">
+    <w:nsid w:val="1AA6047B"/>
+    <w:multiLevelType w:val="hybridMultilevel"/>
+    <w:tmpl w:val="2796ED16"/>
+    <w:lvl w:ilvl="0" w:tplc="08090001">
+      <w:start w:val="1"/>
+      <w:numFmt w:val="bullet"/>
+      <w:lvlText w:val=""/>
+      <w:lvlJc w:val="left"/>
+      <w:pPr>
+        <w:ind w:left="720" w:hanging="360"/>
+      </w:pPr>
+      <w:rPr>
+        <w:rFonts w:ascii="Symbol" w:hAnsi="Symbol" w:hint="default"/>
+      </w:rPr>
+    </w:lvl>
+    <w:lvl w:ilvl="1" w:tplc="08090003" w:tentative="1">
+      <w:start w:val="1"/>
+      <w:numFmt w:val="bullet"/>
+      <w:lvlText w:val="o"/>
+      <w:lvlJc w:val="left"/>
+      <w:pPr>
+        <w:ind w:left="1440" w:hanging="360"/>
+      </w:pPr>
+      <w:rPr>
+        <w:rFonts w:ascii="Courier New" w:hAnsi="Courier New" w:cs="Courier New" w:hint="default"/>
+      </w:rPr>
+    </w:lvl>
+    <w:lvl w:ilvl="2" w:tplc="08090005" w:tentative="1">
+      <w:start w:val="1"/>
+      <w:numFmt w:val="bullet"/>
+      <w:lvlText w:val=""/>
+      <w:lvlJc w:val="left"/>
+      <w:pPr>
+        <w:ind w:left="2160" w:hanging="360"/>
+      </w:pPr>
+      <w:rPr>
+        <w:rFonts w:ascii="Wingdings" w:hAnsi="Wingdings" w:hint="default"/>
+      </w:rPr>
+    </w:lvl>
+    <w:lvl w:ilvl="3" w:tplc="08090001" w:tentative="1">
+      <w:start w:val="1"/>
+      <w:numFmt w:val="bullet"/>
+      <w:lvlText w:val=""/>
+      <w:lvlJc w:val="left"/>
+      <w:pPr>
+        <w:ind w:left="2880" w:hanging="360"/>
+      </w:pPr>
+      <w:rPr>
+        <w:rFonts w:ascii="Symbol" w:hAnsi="Symbol" w:hint="default"/>
+      </w:rPr>
+    </w:lvl>
+    <w:lvl w:ilvl="4" w:tplc="08090003" w:tentative="1">
+      <w:start w:val="1"/>
+      <w:numFmt w:val="bullet"/>
+      <w:lvlText w:val="o"/>
+      <w:lvlJc w:val="left"/>
+      <w:pPr>
+        <w:ind w:left="3600" w:hanging="360"/>
+      </w:pPr>
+      <w:rPr>
+        <w:rFonts w:ascii="Courier New" w:hAnsi="Courier New" w:cs="Courier New" w:hint="default"/>
+      </w:rPr>
+    </w:lvl>
+    <w:lvl w:ilvl="5" w:tplc="08090005" w:tentative="1">
+      <w:start w:val="1"/>
+      <w:numFmt w:val="bullet"/>
+      <w:lvlText w:val=""/>
+      <w:lvlJc w:val="left"/>
+      <w:pPr>
+        <w:ind w:left="4320" w:hanging="360"/>
+      </w:pPr>
+      <w:rPr>
+        <w:rFonts w:ascii="Wingdings" w:hAnsi="Wingdings" w:hint="default"/>
+      </w:rPr>
+    </w:lvl>
+    <w:lvl w:ilvl="6" w:tplc="08090001" w:tentative="1">
+      <w:start w:val="1"/>
+      <w:numFmt w:val="bullet"/>
+      <w:lvlText w:val=""/>
+      <w:lvlJc w:val="left"/>
+      <w:pPr>
+        <w:ind w:left="5040" w:hanging="360"/>
+      </w:pPr>
+      <w:rPr>
+        <w:rFonts w:ascii="Symbol" w:hAnsi="Symbol" w:hint="default"/>
+      </w:rPr>
+    </w:lvl>
+    <w:lvl w:ilvl="7" w:tplc="08090003" w:tentative="1">
+      <w:start w:val="1"/>
+      <w:numFmt w:val="bullet"/>
+      <w:lvlText w:val="o"/>
+      <w:lvlJc w:val="left"/>
+      <w:pPr>
+        <w:ind w:left="5760" w:hanging="360"/>
+      </w:pPr>
+      <w:rPr>
+        <w:rFonts w:ascii="Courier New" w:hAnsi="Courier New" w:cs="Courier New" w:hint="default"/>
+      </w:rPr>
+    </w:lvl>
+    <w:lvl w:ilvl="8" w:tplc="08090005" w:tentative="1">
+      <w:start w:val="1"/>
+      <w:numFmt w:val="bullet"/>
+      <w:lvlText w:val=""/>
+      <w:lvlJc w:val="left"/>
+      <w:pPr>
+        <w:ind w:left="6480" w:hanging="360"/>
+      </w:pPr>
+      <w:rPr>
+        <w:rFonts w:ascii="Wingdings" w:hAnsi="Wingdings" w:hint="default"/>
+      </w:rPr>
+    </w:lvl>
+  </w:abstractNum>
+  <w:abstractNum w:abstractNumId="10" w15:restartNumberingAfterBreak="0">
+    <w:nsid w:val="1F55358D"/>
+    <w:multiLevelType w:val="hybridMultilevel"/>
+    <w:tmpl w:val="7E1EE582"/>
+    <w:lvl w:ilvl="0" w:tplc="1A78E3D8">
+      <w:numFmt w:val="bullet"/>
+      <w:lvlText w:val="-"/>
+      <w:lvlJc w:val="left"/>
+      <w:pPr>
+        <w:ind w:left="816" w:hanging="360"/>
+      </w:pPr>
+      <w:rPr>
+        <w:rFonts w:ascii="Calibri" w:eastAsiaTheme="minorEastAsia" w:hAnsi="Calibri" w:cs="Calibri" w:hint="default"/>
+      </w:rPr>
+    </w:lvl>
+    <w:lvl w:ilvl="1" w:tplc="08090003" w:tentative="1">
+      <w:start w:val="1"/>
+      <w:numFmt w:val="bullet"/>
+      <w:lvlText w:val="o"/>
+      <w:lvlJc w:val="left"/>
+      <w:pPr>
+        <w:ind w:left="1536" w:hanging="360"/>
+      </w:pPr>
+      <w:rPr>
+        <w:rFonts w:ascii="Courier New" w:hAnsi="Courier New" w:cs="Courier New" w:hint="default"/>
+      </w:rPr>
+    </w:lvl>
+    <w:lvl w:ilvl="2" w:tplc="08090005" w:tentative="1">
+      <w:start w:val="1"/>
+      <w:numFmt w:val="bullet"/>
+      <w:lvlText w:val=""/>
+      <w:lvlJc w:val="left"/>
+      <w:pPr>
+        <w:ind w:left="2256" w:hanging="360"/>
+      </w:pPr>
+      <w:rPr>
+        <w:rFonts w:ascii="Wingdings" w:hAnsi="Wingdings" w:hint="default"/>
+      </w:rPr>
+    </w:lvl>
+    <w:lvl w:ilvl="3" w:tplc="08090001" w:tentative="1">
+      <w:start w:val="1"/>
+      <w:numFmt w:val="bullet"/>
+      <w:lvlText w:val=""/>
+      <w:lvlJc w:val="left"/>
+      <w:pPr>
+        <w:ind w:left="2976" w:hanging="360"/>
+      </w:pPr>
+      <w:rPr>
+        <w:rFonts w:ascii="Symbol" w:hAnsi="Symbol" w:hint="default"/>
+      </w:rPr>
+    </w:lvl>
+    <w:lvl w:ilvl="4" w:tplc="08090003" w:tentative="1">
+      <w:start w:val="1"/>
+      <w:numFmt w:val="bullet"/>
+      <w:lvlText w:val="o"/>
+      <w:lvlJc w:val="left"/>
+      <w:pPr>
+        <w:ind w:left="3696" w:hanging="360"/>
+      </w:pPr>
+      <w:rPr>
+        <w:rFonts w:ascii="Courier New" w:hAnsi="Courier New" w:cs="Courier New" w:hint="default"/>
+      </w:rPr>
+    </w:lvl>
+    <w:lvl w:ilvl="5" w:tplc="08090005" w:tentative="1">
+      <w:start w:val="1"/>
+      <w:numFmt w:val="bullet"/>
+      <w:lvlText w:val=""/>
+      <w:lvlJc w:val="left"/>
+      <w:pPr>
+        <w:ind w:left="4416" w:hanging="360"/>
+      </w:pPr>
+      <w:rPr>
+        <w:rFonts w:ascii="Wingdings" w:hAnsi="Wingdings" w:hint="default"/>
+      </w:rPr>
+    </w:lvl>
+    <w:lvl w:ilvl="6" w:tplc="08090001" w:tentative="1">
+      <w:start w:val="1"/>
+      <w:numFmt w:val="bullet"/>
+      <w:lvlText w:val=""/>
+      <w:lvlJc w:val="left"/>
+      <w:pPr>
+        <w:ind w:left="5136" w:hanging="360"/>
+      </w:pPr>
+      <w:rPr>
+        <w:rFonts w:ascii="Symbol" w:hAnsi="Symbol" w:hint="default"/>
+      </w:rPr>
+    </w:lvl>
+    <w:lvl w:ilvl="7" w:tplc="08090003" w:tentative="1">
+      <w:start w:val="1"/>
+      <w:numFmt w:val="bullet"/>
+      <w:lvlText w:val="o"/>
+      <w:lvlJc w:val="left"/>
+      <w:pPr>
+        <w:ind w:left="5856" w:hanging="360"/>
+      </w:pPr>
+      <w:rPr>
+        <w:rFonts w:ascii="Courier New" w:hAnsi="Courier New" w:cs="Courier New" w:hint="default"/>
+      </w:rPr>
+    </w:lvl>
+    <w:lvl w:ilvl="8" w:tplc="08090005" w:tentative="1">
+      <w:start w:val="1"/>
+      <w:numFmt w:val="bullet"/>
+      <w:lvlText w:val=""/>
+      <w:lvlJc w:val="left"/>
+      <w:pPr>
+        <w:ind w:left="6576" w:hanging="360"/>
+      </w:pPr>
+      <w:rPr>
+        <w:rFonts w:ascii="Wingdings" w:hAnsi="Wingdings" w:hint="default"/>
+      </w:rPr>
+    </w:lvl>
+  </w:abstractNum>
+  <w:abstractNum w:abstractNumId="11" w15:restartNumberingAfterBreak="0">
+    <w:nsid w:val="42FC0289"/>
+    <w:multiLevelType w:val="hybridMultilevel"/>
+    <w:tmpl w:val="CA4E87E6"/>
+    <w:lvl w:ilvl="0" w:tplc="08090001">
+      <w:start w:val="1"/>
+      <w:numFmt w:val="bullet"/>
+      <w:lvlText w:val=""/>
+      <w:lvlJc w:val="left"/>
+      <w:pPr>
+        <w:ind w:left="720" w:hanging="360"/>
+      </w:pPr>
+      <w:rPr>
+        <w:rFonts w:ascii="Symbol" w:hAnsi="Symbol" w:hint="default"/>
+      </w:rPr>
+    </w:lvl>
+    <w:lvl w:ilvl="1" w:tplc="08090003" w:tentative="1">
+      <w:start w:val="1"/>
+      <w:numFmt w:val="bullet"/>
+      <w:lvlText w:val="o"/>
+      <w:lvlJc w:val="left"/>
+      <w:pPr>
+        <w:ind w:left="1440" w:hanging="360"/>
+      </w:pPr>
+      <w:rPr>
+        <w:rFonts w:ascii="Courier New" w:hAnsi="Courier New" w:cs="Courier New" w:hint="default"/>
+      </w:rPr>
+    </w:lvl>
+    <w:lvl w:ilvl="2" w:tplc="08090005" w:tentative="1">
+      <w:start w:val="1"/>
+      <w:numFmt w:val="bullet"/>
+      <w:lvlText w:val=""/>
+      <w:lvlJc w:val="left"/>
+      <w:pPr>
+        <w:ind w:left="2160" w:hanging="360"/>
+      </w:pPr>
+      <w:rPr>
+        <w:rFonts w:ascii="Wingdings" w:hAnsi="Wingdings" w:hint="default"/>
+      </w:rPr>
+    </w:lvl>
+    <w:lvl w:ilvl="3" w:tplc="08090001" w:tentative="1">
+      <w:start w:val="1"/>
+      <w:numFmt w:val="bullet"/>
+      <w:lvlText w:val=""/>
+      <w:lvlJc w:val="left"/>
+      <w:pPr>
+        <w:ind w:left="2880" w:hanging="360"/>
+      </w:pPr>
+      <w:rPr>
+        <w:rFonts w:ascii="Symbol" w:hAnsi="Symbol" w:hint="default"/>
+      </w:rPr>
+    </w:lvl>
+    <w:lvl w:ilvl="4" w:tplc="08090003" w:tentative="1">
+      <w:start w:val="1"/>
+      <w:numFmt w:val="bullet"/>
+      <w:lvlText w:val="o"/>
+      <w:lvlJc w:val="left"/>
+      <w:pPr>
+        <w:ind w:left="3600" w:hanging="360"/>
+      </w:pPr>
+      <w:rPr>
+        <w:rFonts w:ascii="Courier New" w:hAnsi="Courier New" w:cs="Courier New" w:hint="default"/>
+      </w:rPr>
+    </w:lvl>
+    <w:lvl w:ilvl="5" w:tplc="08090005" w:tentative="1">
+      <w:start w:val="1"/>
+      <w:numFmt w:val="bullet"/>
+      <w:lvlText w:val=""/>
+      <w:lvlJc w:val="left"/>
+      <w:pPr>
+        <w:ind w:left="4320" w:hanging="360"/>
+      </w:pPr>
+      <w:rPr>
+        <w:rFonts w:ascii="Wingdings" w:hAnsi="Wingdings" w:hint="default"/>
+      </w:rPr>
+    </w:lvl>
+    <w:lvl w:ilvl="6" w:tplc="08090001" w:tentative="1">
+      <w:start w:val="1"/>
+      <w:numFmt w:val="bullet"/>
+      <w:lvlText w:val=""/>
+      <w:lvlJc w:val="left"/>
+      <w:pPr>
+        <w:ind w:left="5040" w:hanging="360"/>
+      </w:pPr>
+      <w:rPr>
+        <w:rFonts w:ascii="Symbol" w:hAnsi="Symbol" w:hint="default"/>
+      </w:rPr>
+    </w:lvl>
+    <w:lvl w:ilvl="7" w:tplc="08090003" w:tentative="1">
+      <w:start w:val="1"/>
+      <w:numFmt w:val="bullet"/>
+      <w:lvlText w:val="o"/>
+      <w:lvlJc w:val="left"/>
+      <w:pPr>
+        <w:ind w:left="5760" w:hanging="360"/>
+      </w:pPr>
+      <w:rPr>
+        <w:rFonts w:ascii="Courier New" w:hAnsi="Courier New" w:cs="Courier New" w:hint="default"/>
+      </w:rPr>
+    </w:lvl>
+    <w:lvl w:ilvl="8" w:tplc="08090005" w:tentative="1">
+      <w:start w:val="1"/>
+      <w:numFmt w:val="bullet"/>
+      <w:lvlText w:val=""/>
+      <w:lvlJc w:val="left"/>
+      <w:pPr>
+        <w:ind w:left="6480" w:hanging="360"/>
+      </w:pPr>
+      <w:rPr>
+        <w:rFonts w:ascii="Wingdings" w:hAnsi="Wingdings" w:hint="default"/>
+      </w:rPr>
+    </w:lvl>
+  </w:abstractNum>
+  <w:abstractNum w:abstractNumId="12" w15:restartNumberingAfterBreak="0">
+    <w:nsid w:val="63021E20"/>
+    <w:multiLevelType w:val="hybridMultilevel"/>
+    <w:tmpl w:val="B346327C"/>
+    <w:lvl w:ilvl="0" w:tplc="08090001">
+      <w:start w:val="1"/>
+      <w:numFmt w:val="bullet"/>
+      <w:lvlText w:val=""/>
+      <w:lvlJc w:val="left"/>
+      <w:pPr>
+        <w:ind w:left="720" w:hanging="360"/>
+      </w:pPr>
+      <w:rPr>
+        <w:rFonts w:ascii="Symbol" w:hAnsi="Symbol" w:hint="default"/>
+      </w:rPr>
+    </w:lvl>
+    <w:lvl w:ilvl="1" w:tplc="08090003" w:tentative="1">
+      <w:start w:val="1"/>
+      <w:numFmt w:val="bullet"/>
+      <w:lvlText w:val="o"/>
+      <w:lvlJc w:val="left"/>
+      <w:pPr>
+        <w:ind w:left="1440" w:hanging="360"/>
+      </w:pPr>
+      <w:rPr>
+        <w:rFonts w:ascii="Courier New" w:hAnsi="Courier New" w:cs="Courier New" w:hint="default"/>
+      </w:rPr>
+    </w:lvl>
+    <w:lvl w:ilvl="2" w:tplc="08090005" w:tentative="1">
+      <w:start w:val="1"/>
+      <w:numFmt w:val="bullet"/>
+      <w:lvlText w:val=""/>
+      <w:lvlJc w:val="left"/>
+      <w:pPr>
+        <w:ind w:left="2160" w:hanging="360"/>
+      </w:pPr>
+      <w:rPr>
+        <w:rFonts w:ascii="Wingdings" w:hAnsi="Wingdings" w:hint="default"/>
+      </w:rPr>
+    </w:lvl>
+    <w:lvl w:ilvl="3" w:tplc="08090001" w:tentative="1">
+      <w:start w:val="1"/>
+      <w:numFmt w:val="bullet"/>
+      <w:lvlText w:val=""/>
+      <w:lvlJc w:val="left"/>
+      <w:pPr>
+        <w:ind w:left="2880" w:hanging="360"/>
+      </w:pPr>
+      <w:rPr>
+        <w:rFonts w:ascii="Symbol" w:hAnsi="Symbol" w:hint="default"/>
+      </w:rPr>
+    </w:lvl>
+    <w:lvl w:ilvl="4" w:tplc="08090003" w:tentative="1">
+      <w:start w:val="1"/>
+      <w:numFmt w:val="bullet"/>
+      <w:lvlText w:val="o"/>
+      <w:lvlJc w:val="left"/>
+      <w:pPr>
+        <w:ind w:left="3600" w:hanging="360"/>
+      </w:pPr>
+      <w:rPr>
+        <w:rFonts w:ascii="Courier New" w:hAnsi="Courier New" w:cs="Courier New" w:hint="default"/>
+      </w:rPr>
+    </w:lvl>
+    <w:lvl w:ilvl="5" w:tplc="08090005" w:tentative="1">
+      <w:start w:val="1"/>
+      <w:numFmt w:val="bullet"/>
+      <w:lvlText w:val=""/>
+      <w:lvlJc w:val="left"/>
+      <w:pPr>
+        <w:ind w:left="4320" w:hanging="360"/>
+      </w:pPr>
+      <w:rPr>
+        <w:rFonts w:ascii="Wingdings" w:hAnsi="Wingdings" w:hint="default"/>
+      </w:rPr>
+    </w:lvl>
+    <w:lvl w:ilvl="6" w:tplc="08090001" w:tentative="1">
+      <w:start w:val="1"/>
+      <w:numFmt w:val="bullet"/>
+      <w:lvlText w:val=""/>
+      <w:lvlJc w:val="left"/>
+      <w:pPr>
+        <w:ind w:left="5040" w:hanging="360"/>
+      </w:pPr>
+      <w:rPr>
+        <w:rFonts w:ascii="Symbol" w:hAnsi="Symbol" w:hint="default"/>
+      </w:rPr>
+    </w:lvl>
+    <w:lvl w:ilvl="7" w:tplc="08090003" w:tentative="1">
+      <w:start w:val="1"/>
+      <w:numFmt w:val="bullet"/>
+      <w:lvlText w:val="o"/>
+      <w:lvlJc w:val="left"/>
+      <w:pPr>
+        <w:ind w:left="5760" w:hanging="360"/>
+      </w:pPr>
+      <w:rPr>
+        <w:rFonts w:ascii="Courier New" w:hAnsi="Courier New" w:cs="Courier New" w:hint="default"/>
+      </w:rPr>
+    </w:lvl>
+    <w:lvl w:ilvl="8" w:tplc="08090005" w:tentative="1">
+      <w:start w:val="1"/>
+      <w:numFmt w:val="bullet"/>
+      <w:lvlText w:val=""/>
+      <w:lvlJc w:val="left"/>
+      <w:pPr>
+        <w:ind w:left="6480" w:hanging="360"/>
+      </w:pPr>
+      <w:rPr>
+        <w:rFonts w:ascii="Wingdings" w:hAnsi="Wingdings" w:hint="default"/>
       </w:rPr>
     </w:lvl>
   </w:abstractNum>
@@ -613,6 +1483,18 @@
   </w:num>
   <w:num w:numId="9" w16cid:durableId="1803230274">
     <w:abstractNumId w:val="0"/>
+  </w:num>
+  <w:num w:numId="10" w16cid:durableId="1801462647">
+    <w:abstractNumId w:val="11"/>
+  </w:num>
+  <w:num w:numId="11" w16cid:durableId="1379470273">
+    <w:abstractNumId w:val="10"/>
+  </w:num>
+  <w:num w:numId="12" w16cid:durableId="390731227">
+    <w:abstractNumId w:val="9"/>
+  </w:num>
+  <w:num w:numId="13" w16cid:durableId="472522866">
+    <w:abstractNumId w:val="12"/>
   </w:num>
 </w:numbering>
 </file>
@@ -1223,7 +2105,6 @@
   <w:style w:type="character" w:default="1" w:styleId="DefaultParagraphFont">
     <w:name w:val="Default Paragraph Font"/>
     <w:uiPriority w:val="1"/>
-    <w:semiHidden/>
     <w:unhideWhenUsed/>
   </w:style>
   <w:style w:type="table" w:default="1" w:styleId="TableNormal">

</xml_diff>